<commit_message>
feat(report): update evaluation templates to include average score calculations and improve document formatting
</commit_message>
<xml_diff>
--- a/template/SIDANG/BA sidang akhir TEMPLATE.docx
+++ b/template/SIDANG/BA sidang akhir TEMPLATE.docx
@@ -854,7 +854,7 @@
                 <w:color w:val="000000" w:themeColor="text1"/>
                 <w:lang w:val="en-US"/>
               </w:rPr>
-              <w:t>Nilai rata2</w:t>
+              <w:t>${nilai_rata2}</w:t>
             </w:r>
           </w:p>
         </w:tc>
@@ -967,7 +967,7 @@
                 <w:color w:val="000000" w:themeColor="text1"/>
                 <w:lang w:val="en-US"/>
               </w:rPr>
-              <w:t>Nilai rata2</w:t>
+              <w:t>${nilai_rata2}</w:t>
             </w:r>
           </w:p>
         </w:tc>
@@ -1052,7 +1052,7 @@
                 <w:color w:val="000000" w:themeColor="text1"/>
                 <w:lang w:val="en-US"/>
               </w:rPr>
-              <w:t>Nilai rata2</w:t>
+              <w:t>${nilai_rata2}</w:t>
             </w:r>
           </w:p>
         </w:tc>
@@ -1151,7 +1151,7 @@
                 <w:color w:val="000000" w:themeColor="text1"/>
                 <w:lang w:val="en-US"/>
               </w:rPr>
-              <w:t>Nilai rata2</w:t>
+              <w:t>${nilai_rata2}</w:t>
             </w:r>
           </w:p>
         </w:tc>
@@ -1250,7 +1250,7 @@
                 <w:color w:val="000000" w:themeColor="text1"/>
                 <w:lang w:val="en-US"/>
               </w:rPr>
-              <w:t>Nilai rata2</w:t>
+              <w:t>${nilai_rata2}</w:t>
             </w:r>
           </w:p>
         </w:tc>
@@ -1347,7 +1347,7 @@
                 <w:color w:val="000000" w:themeColor="text1"/>
                 <w:lang w:val="en-US"/>
               </w:rPr>
-              <w:t>Nilai rata2</w:t>
+              <w:t>${nilai_rata2}</w:t>
             </w:r>
           </w:p>
         </w:tc>
@@ -1444,6 +1444,12 @@
                 <w:color w:val="000000" w:themeColor="text1"/>
               </w:rPr>
             </w:pPr>
+            <w:r>
+              <w:rPr>
+                <w:color w:val="000000" w:themeColor="text1"/>
+              </w:rPr>
+              <w:t>${nilai_rata_rata}</w:t>
+            </w:r>
           </w:p>
         </w:tc>
         <w:tc>
@@ -1694,6 +1700,12 @@
                 <w:color w:val="000000" w:themeColor="text1"/>
               </w:rPr>
             </w:pPr>
+            <w:r>
+              <w:rPr>
+                <w:color w:val="000000" w:themeColor="text1"/>
+              </w:rPr>
+              <w:t>${nilai_akhir_index}</w:t>
+            </w:r>
           </w:p>
         </w:tc>
         <w:tc>

</xml_diff>

<commit_message>
perbiakan untuk print word
</commit_message>
<xml_diff>
--- a/template/SIDANG/BA sidang akhir TEMPLATE.docx
+++ b/template/SIDANG/BA sidang akhir TEMPLATE.docx
@@ -1,6 +1,6 @@
 
 <file path=word/document.xml><?xml version="1.0" encoding="utf-8"?>
-<w:document xmlns:wpc="http://schemas.microsoft.com/office/word/2010/wordprocessingCanvas" xmlns:cx="http://schemas.microsoft.com/office/drawing/2014/chartex" xmlns:cx1="http://schemas.microsoft.com/office/drawing/2015/9/8/chartex" xmlns:cx2="http://schemas.microsoft.com/office/drawing/2015/10/21/chartex" xmlns:cx3="http://schemas.microsoft.com/office/drawing/2016/5/9/chartex" xmlns:cx4="http://schemas.microsoft.com/office/drawing/2016/5/10/chartex" xmlns:cx5="http://schemas.microsoft.com/office/drawing/2016/5/11/chartex" xmlns:cx6="http://schemas.microsoft.com/office/drawing/2016/5/12/chartex" xmlns:cx7="http://schemas.microsoft.com/office/drawing/2016/5/13/chartex" xmlns:cx8="http://schemas.microsoft.com/office/drawing/2016/5/14/chartex" xmlns:mc="http://schemas.openxmlformats.org/markup-compatibility/2006" xmlns:aink="http://schemas.microsoft.com/office/drawing/2016/ink" xmlns:am3d="http://schemas.microsoft.com/office/drawing/2017/model3d" xmlns:o="urn:schemas-microsoft-com:office:office" xmlns:oel="http://schemas.microsoft.com/office/2019/extlst" xmlns:r="http://schemas.openxmlformats.org/officeDocument/2006/relationships" xmlns:m="http://schemas.openxmlformats.org/officeDocument/2006/math" xmlns:v="urn:schemas-microsoft-com:vml" xmlns:wp14="http://schemas.microsoft.com/office/word/2010/wordprocessingDrawing" xmlns:wp="http://schemas.openxmlformats.org/drawingml/2006/wordprocessingDrawing" xmlns:w10="urn:schemas-microsoft-com:office:word" xmlns:w="http://schemas.openxmlformats.org/wordprocessingml/2006/main" xmlns:w14="http://schemas.microsoft.com/office/word/2010/wordml" xmlns:w15="http://schemas.microsoft.com/office/word/2012/wordml" xmlns:w16cei="http://schemas.microsoft.com/office/word/2026/wordml/cei" xmlns:w16cex="http://schemas.microsoft.com/office/word/2018/wordml/cex" xmlns:w16cid="http://schemas.microsoft.com/office/word/2016/wordml/cid" xmlns:w16="http://schemas.microsoft.com/office/word/2018/wordml" xmlns:w16du="http://schemas.microsoft.com/office/word/2023/wordml/word16du" xmlns:w16sdtdh="http://schemas.microsoft.com/office/word/2020/wordml/sdtdatahash" xmlns:w16sdtfl="http://schemas.microsoft.com/office/word/2024/wordml/sdtformatlock" xmlns:w16se="http://schemas.microsoft.com/office/word/2015/wordml/symex" xmlns:wpg="http://schemas.microsoft.com/office/word/2010/wordprocessingGroup" xmlns:wpi="http://schemas.microsoft.com/office/word/2010/wordprocessingInk" xmlns:wne="http://schemas.microsoft.com/office/word/2006/wordml" xmlns:wps="http://schemas.microsoft.com/office/word/2010/wordprocessingShape" mc:Ignorable="w14 w15 w16se w16cid w16 w16cex w16sdtdh w16sdtfl w16du wp14">
+<w:document xmlns:wpc="http://schemas.microsoft.com/office/word/2010/wordprocessingCanvas" xmlns:cx="http://schemas.microsoft.com/office/drawing/2014/chartex" xmlns:cx1="http://schemas.microsoft.com/office/drawing/2015/9/8/chartex" xmlns:cx2="http://schemas.microsoft.com/office/drawing/2015/10/21/chartex" xmlns:cx3="http://schemas.microsoft.com/office/drawing/2016/5/9/chartex" xmlns:cx4="http://schemas.microsoft.com/office/drawing/2016/5/10/chartex" xmlns:cx5="http://schemas.microsoft.com/office/drawing/2016/5/11/chartex" xmlns:cx6="http://schemas.microsoft.com/office/drawing/2016/5/12/chartex" xmlns:cx7="http://schemas.microsoft.com/office/drawing/2016/5/13/chartex" xmlns:cx8="http://schemas.microsoft.com/office/drawing/2016/5/14/chartex" xmlns:mc="http://schemas.openxmlformats.org/markup-compatibility/2006" xmlns:aink="http://schemas.microsoft.com/office/drawing/2016/ink" xmlns:am3d="http://schemas.microsoft.com/office/drawing/2017/model3d" xmlns:o="urn:schemas-microsoft-com:office:office" xmlns:oel="http://schemas.microsoft.com/office/2019/extlst" xmlns:r="http://schemas.openxmlformats.org/officeDocument/2006/relationships" xmlns:m="http://schemas.openxmlformats.org/officeDocument/2006/math" xmlns:v="urn:schemas-microsoft-com:vml" xmlns:wp14="http://schemas.microsoft.com/office/word/2010/wordprocessingDrawing" xmlns:wp="http://schemas.openxmlformats.org/drawingml/2006/wordprocessingDrawing" xmlns:w10="urn:schemas-microsoft-com:office:word" xmlns:w="http://schemas.openxmlformats.org/wordprocessingml/2006/main" xmlns:w14="http://schemas.microsoft.com/office/word/2010/wordml" xmlns:w15="http://schemas.microsoft.com/office/word/2012/wordml" xmlns:w16cex="http://schemas.microsoft.com/office/word/2018/wordml/cex" xmlns:w16cid="http://schemas.microsoft.com/office/word/2016/wordml/cid" xmlns:w16="http://schemas.microsoft.com/office/word/2018/wordml" xmlns:w16du="http://schemas.microsoft.com/office/word/2023/wordml/word16du" xmlns:w16sdtdh="http://schemas.microsoft.com/office/word/2020/wordml/sdtdatahash" xmlns:w16sdtfl="http://schemas.microsoft.com/office/word/2024/wordml/sdtformatlock" xmlns:w16se="http://schemas.microsoft.com/office/word/2015/wordml/symex" xmlns:wpg="http://schemas.microsoft.com/office/word/2010/wordprocessingGroup" xmlns:wpi="http://schemas.microsoft.com/office/word/2010/wordprocessingInk" xmlns:wne="http://schemas.microsoft.com/office/word/2006/wordml" xmlns:wps="http://schemas.microsoft.com/office/word/2010/wordprocessingShape" mc:Ignorable="w14 w15 w16se w16cid w16 w16cex w16sdtdh w16sdtfl w16du wp14">
   <w:body>
     <w:p>
       <w:pPr>
@@ -2909,6 +2909,7 @@
           <w:color w:val="000000" w:themeColor="text1"/>
           <w:sz w:val="22"/>
         </w:rPr>
+        <w:lastRenderedPageBreak/>
         <w:br w:type="page"/>
       </w:r>
     </w:p>
@@ -4087,6 +4088,23 @@
           <w:sz w:val="26"/>
         </w:rPr>
       </w:pPr>
+      <w:r>
+        <w:rPr>
+          <w:rFonts w:ascii="Times New Roman" w:hAnsi="Times New Roman" w:cs="Times New Roman"/>
+          <w:color w:val="000000" w:themeColor="text1"/>
+          <w:sz w:val="26"/>
+          <w:lang w:val="fi-FI"/>
+        </w:rPr>
+        <w:t xml:space="preserve">Tanda Tangan                                                 </w:t>
+      </w:r>
+      <w:r>
+        <w:rPr>
+          <w:rFonts w:ascii="Times New Roman" w:hAnsi="Times New Roman" w:cs="Times New Roman"/>
+          <w:color w:val="000000" w:themeColor="text1"/>
+          <w:sz w:val="26"/>
+        </w:rPr>
+        <w:t>Tanda Tangan</w:t>
+      </w:r>
     </w:p>
     <w:p>
       <w:pPr>
@@ -4160,7 +4178,7 @@
           <w:color w:val="000000" w:themeColor="text1"/>
           <w:lang w:val="fi-FI"/>
         </w:rPr>
-        <w:t>Tanda</w:t>
+        <w:t>${signature}</w:t>
       </w:r>
       <w:r>
         <w:rPr>
@@ -4169,7 +4187,7 @@
           <w:spacing w:val="-3"/>
           <w:lang w:val="fi-FI"/>
         </w:rPr>
-        <w:t xml:space="preserve"> </w:t>
+        <w:t xml:space="preserve"/>
       </w:r>
       <w:r>
         <w:rPr>
@@ -4177,7 +4195,7 @@
           <w:color w:val="000000" w:themeColor="text1"/>
           <w:lang w:val="fi-FI"/>
         </w:rPr>
-        <w:t>Tangan</w:t>
+        <w:t/>
       </w:r>
       <w:r>
         <w:rPr>
@@ -4186,7 +4204,7 @@
           <w:spacing w:val="-2"/>
           <w:lang w:val="fi-FI"/>
         </w:rPr>
-        <w:t xml:space="preserve"> </w:t>
+        <w:t xml:space="preserve"/>
       </w:r>
       <w:r>
         <w:rPr>
@@ -4194,7 +4212,7 @@
           <w:color w:val="000000" w:themeColor="text1"/>
           <w:lang w:val="fi-FI"/>
         </w:rPr>
-        <w:t>dan</w:t>
+        <w:t/>
       </w:r>
       <w:r>
         <w:rPr>
@@ -4203,7 +4221,7 @@
           <w:spacing w:val="-2"/>
           <w:lang w:val="fi-FI"/>
         </w:rPr>
-        <w:t xml:space="preserve"> </w:t>
+        <w:t xml:space="preserve"/>
       </w:r>
       <w:r>
         <w:rPr>
@@ -4211,7 +4229,7 @@
           <w:color w:val="000000" w:themeColor="text1"/>
           <w:lang w:val="fi-FI"/>
         </w:rPr>
-        <w:t>Nama</w:t>
+        <w:t/>
       </w:r>
       <w:r>
         <w:rPr>
@@ -4220,7 +4238,7 @@
           <w:spacing w:val="-2"/>
           <w:lang w:val="fi-FI"/>
         </w:rPr>
-        <w:t xml:space="preserve"> Jelas</w:t>
+        <w:t xml:space="preserve"/>
       </w:r>
       <w:r>
         <w:rPr>
@@ -4229,7 +4247,7 @@
           <w:lang w:val="fi-FI"/>
         </w:rPr>
         <w:tab/>
-        <w:t>Tanda</w:t>
+        <w:t>${signature}</w:t>
       </w:r>
       <w:r>
         <w:rPr>
@@ -4238,7 +4256,7 @@
           <w:spacing w:val="-3"/>
           <w:lang w:val="fi-FI"/>
         </w:rPr>
-        <w:t xml:space="preserve"> </w:t>
+        <w:t xml:space="preserve"/>
       </w:r>
       <w:r>
         <w:rPr>
@@ -4246,7 +4264,7 @@
           <w:color w:val="000000" w:themeColor="text1"/>
           <w:lang w:val="fi-FI"/>
         </w:rPr>
-        <w:t>Tangan</w:t>
+        <w:t/>
       </w:r>
       <w:r>
         <w:rPr>
@@ -4255,7 +4273,7 @@
           <w:spacing w:val="-2"/>
           <w:lang w:val="fi-FI"/>
         </w:rPr>
-        <w:t xml:space="preserve"> </w:t>
+        <w:t xml:space="preserve"/>
       </w:r>
       <w:r>
         <w:rPr>
@@ -4263,7 +4281,7 @@
           <w:color w:val="000000" w:themeColor="text1"/>
           <w:lang w:val="fi-FI"/>
         </w:rPr>
-        <w:t>dan</w:t>
+        <w:t/>
       </w:r>
       <w:r>
         <w:rPr>
@@ -4272,7 +4290,7 @@
           <w:spacing w:val="-2"/>
           <w:lang w:val="fi-FI"/>
         </w:rPr>
-        <w:t xml:space="preserve"> </w:t>
+        <w:t xml:space="preserve"/>
       </w:r>
       <w:r>
         <w:rPr>
@@ -4280,7 +4298,7 @@
           <w:color w:val="000000" w:themeColor="text1"/>
           <w:lang w:val="fi-FI"/>
         </w:rPr>
-        <w:t>Nama</w:t>
+        <w:t/>
       </w:r>
       <w:r>
         <w:rPr>
@@ -4289,11 +4307,11 @@
           <w:spacing w:val="-2"/>
           <w:lang w:val="fi-FI"/>
         </w:rPr>
-        <w:t xml:space="preserve"> Jelas</w:t>
+        <w:t xml:space="preserve"/>
       </w:r>
     </w:p>
     <w:sectPr>
-      <w:headerReference w:type="default" r:id="rId7"/>
+      <w:headerReference w:type="default" r:id="rId8"/>
       <w:pgSz w:w="11906" w:h="16838" w:code="9"/>
       <w:pgMar w:top="1440" w:right="926" w:bottom="1440" w:left="1440" w:header="708" w:footer="708" w:gutter="0"/>
       <w:cols w:space="708"/>
@@ -4304,7 +4322,7 @@
 </file>
 
 <file path=word/endnotes.xml><?xml version="1.0" encoding="utf-8"?>
-<w:endnotes xmlns:wpc="http://schemas.microsoft.com/office/word/2010/wordprocessingCanvas" xmlns:cx="http://schemas.microsoft.com/office/drawing/2014/chartex" xmlns:cx1="http://schemas.microsoft.com/office/drawing/2015/9/8/chartex" xmlns:cx2="http://schemas.microsoft.com/office/drawing/2015/10/21/chartex" xmlns:cx3="http://schemas.microsoft.com/office/drawing/2016/5/9/chartex" xmlns:cx4="http://schemas.microsoft.com/office/drawing/2016/5/10/chartex" xmlns:cx5="http://schemas.microsoft.com/office/drawing/2016/5/11/chartex" xmlns:cx6="http://schemas.microsoft.com/office/drawing/2016/5/12/chartex" xmlns:cx7="http://schemas.microsoft.com/office/drawing/2016/5/13/chartex" xmlns:cx8="http://schemas.microsoft.com/office/drawing/2016/5/14/chartex" xmlns:mc="http://schemas.openxmlformats.org/markup-compatibility/2006" xmlns:aink="http://schemas.microsoft.com/office/drawing/2016/ink" xmlns:am3d="http://schemas.microsoft.com/office/drawing/2017/model3d" xmlns:o="urn:schemas-microsoft-com:office:office" xmlns:oel="http://schemas.microsoft.com/office/2019/extlst" xmlns:r="http://schemas.openxmlformats.org/officeDocument/2006/relationships" xmlns:m="http://schemas.openxmlformats.org/officeDocument/2006/math" xmlns:v="urn:schemas-microsoft-com:vml" xmlns:wp14="http://schemas.microsoft.com/office/word/2010/wordprocessingDrawing" xmlns:wp="http://schemas.openxmlformats.org/drawingml/2006/wordprocessingDrawing" xmlns:w10="urn:schemas-microsoft-com:office:word" xmlns:w="http://schemas.openxmlformats.org/wordprocessingml/2006/main" xmlns:w14="http://schemas.microsoft.com/office/word/2010/wordml" xmlns:w15="http://schemas.microsoft.com/office/word/2012/wordml" xmlns:w16cei="http://schemas.microsoft.com/office/word/2026/wordml/cei" xmlns:w16cex="http://schemas.microsoft.com/office/word/2018/wordml/cex" xmlns:w16cid="http://schemas.microsoft.com/office/word/2016/wordml/cid" xmlns:w16="http://schemas.microsoft.com/office/word/2018/wordml" xmlns:w16du="http://schemas.microsoft.com/office/word/2023/wordml/word16du" xmlns:w16sdtdh="http://schemas.microsoft.com/office/word/2020/wordml/sdtdatahash" xmlns:w16sdtfl="http://schemas.microsoft.com/office/word/2024/wordml/sdtformatlock" xmlns:w16se="http://schemas.microsoft.com/office/word/2015/wordml/symex" xmlns:wpg="http://schemas.microsoft.com/office/word/2010/wordprocessingGroup" xmlns:wpi="http://schemas.microsoft.com/office/word/2010/wordprocessingInk" xmlns:wne="http://schemas.microsoft.com/office/word/2006/wordml" xmlns:wps="http://schemas.microsoft.com/office/word/2010/wordprocessingShape" mc:Ignorable="w14 w15 w16se w16cid w16 w16cex w16sdtdh w16sdtfl w16du wp14">
+<w:endnotes xmlns:wpc="http://schemas.microsoft.com/office/word/2010/wordprocessingCanvas" xmlns:cx="http://schemas.microsoft.com/office/drawing/2014/chartex" xmlns:cx1="http://schemas.microsoft.com/office/drawing/2015/9/8/chartex" xmlns:cx2="http://schemas.microsoft.com/office/drawing/2015/10/21/chartex" xmlns:cx3="http://schemas.microsoft.com/office/drawing/2016/5/9/chartex" xmlns:cx4="http://schemas.microsoft.com/office/drawing/2016/5/10/chartex" xmlns:cx5="http://schemas.microsoft.com/office/drawing/2016/5/11/chartex" xmlns:cx6="http://schemas.microsoft.com/office/drawing/2016/5/12/chartex" xmlns:cx7="http://schemas.microsoft.com/office/drawing/2016/5/13/chartex" xmlns:cx8="http://schemas.microsoft.com/office/drawing/2016/5/14/chartex" xmlns:mc="http://schemas.openxmlformats.org/markup-compatibility/2006" xmlns:aink="http://schemas.microsoft.com/office/drawing/2016/ink" xmlns:am3d="http://schemas.microsoft.com/office/drawing/2017/model3d" xmlns:o="urn:schemas-microsoft-com:office:office" xmlns:oel="http://schemas.microsoft.com/office/2019/extlst" xmlns:r="http://schemas.openxmlformats.org/officeDocument/2006/relationships" xmlns:m="http://schemas.openxmlformats.org/officeDocument/2006/math" xmlns:v="urn:schemas-microsoft-com:vml" xmlns:wp14="http://schemas.microsoft.com/office/word/2010/wordprocessingDrawing" xmlns:wp="http://schemas.openxmlformats.org/drawingml/2006/wordprocessingDrawing" xmlns:w10="urn:schemas-microsoft-com:office:word" xmlns:w="http://schemas.openxmlformats.org/wordprocessingml/2006/main" xmlns:w14="http://schemas.microsoft.com/office/word/2010/wordml" xmlns:w15="http://schemas.microsoft.com/office/word/2012/wordml" xmlns:w16cex="http://schemas.microsoft.com/office/word/2018/wordml/cex" xmlns:w16cid="http://schemas.microsoft.com/office/word/2016/wordml/cid" xmlns:w16="http://schemas.microsoft.com/office/word/2018/wordml" xmlns:w16du="http://schemas.microsoft.com/office/word/2023/wordml/word16du" xmlns:w16sdtdh="http://schemas.microsoft.com/office/word/2020/wordml/sdtdatahash" xmlns:w16sdtfl="http://schemas.microsoft.com/office/word/2024/wordml/sdtformatlock" xmlns:w16se="http://schemas.microsoft.com/office/word/2015/wordml/symex" xmlns:wpg="http://schemas.microsoft.com/office/word/2010/wordprocessingGroup" xmlns:wpi="http://schemas.microsoft.com/office/word/2010/wordprocessingInk" xmlns:wne="http://schemas.microsoft.com/office/word/2006/wordml" xmlns:wps="http://schemas.microsoft.com/office/word/2010/wordprocessingShape" mc:Ignorable="w14 w15 w16se w16cid w16 w16cex w16sdtdh w16sdtfl w16du wp14">
   <w:endnote w:type="separator" w:id="-1">
     <w:p>
       <w:r>
@@ -4323,7 +4341,7 @@
 </file>
 
 <file path=word/footnotes.xml><?xml version="1.0" encoding="utf-8"?>
-<w:footnotes xmlns:wpc="http://schemas.microsoft.com/office/word/2010/wordprocessingCanvas" xmlns:cx="http://schemas.microsoft.com/office/drawing/2014/chartex" xmlns:cx1="http://schemas.microsoft.com/office/drawing/2015/9/8/chartex" xmlns:cx2="http://schemas.microsoft.com/office/drawing/2015/10/21/chartex" xmlns:cx3="http://schemas.microsoft.com/office/drawing/2016/5/9/chartex" xmlns:cx4="http://schemas.microsoft.com/office/drawing/2016/5/10/chartex" xmlns:cx5="http://schemas.microsoft.com/office/drawing/2016/5/11/chartex" xmlns:cx6="http://schemas.microsoft.com/office/drawing/2016/5/12/chartex" xmlns:cx7="http://schemas.microsoft.com/office/drawing/2016/5/13/chartex" xmlns:cx8="http://schemas.microsoft.com/office/drawing/2016/5/14/chartex" xmlns:mc="http://schemas.openxmlformats.org/markup-compatibility/2006" xmlns:aink="http://schemas.microsoft.com/office/drawing/2016/ink" xmlns:am3d="http://schemas.microsoft.com/office/drawing/2017/model3d" xmlns:o="urn:schemas-microsoft-com:office:office" xmlns:oel="http://schemas.microsoft.com/office/2019/extlst" xmlns:r="http://schemas.openxmlformats.org/officeDocument/2006/relationships" xmlns:m="http://schemas.openxmlformats.org/officeDocument/2006/math" xmlns:v="urn:schemas-microsoft-com:vml" xmlns:wp14="http://schemas.microsoft.com/office/word/2010/wordprocessingDrawing" xmlns:wp="http://schemas.openxmlformats.org/drawingml/2006/wordprocessingDrawing" xmlns:w10="urn:schemas-microsoft-com:office:word" xmlns:w="http://schemas.openxmlformats.org/wordprocessingml/2006/main" xmlns:w14="http://schemas.microsoft.com/office/word/2010/wordml" xmlns:w15="http://schemas.microsoft.com/office/word/2012/wordml" xmlns:w16cei="http://schemas.microsoft.com/office/word/2026/wordml/cei" xmlns:w16cex="http://schemas.microsoft.com/office/word/2018/wordml/cex" xmlns:w16cid="http://schemas.microsoft.com/office/word/2016/wordml/cid" xmlns:w16="http://schemas.microsoft.com/office/word/2018/wordml" xmlns:w16du="http://schemas.microsoft.com/office/word/2023/wordml/word16du" xmlns:w16sdtdh="http://schemas.microsoft.com/office/word/2020/wordml/sdtdatahash" xmlns:w16sdtfl="http://schemas.microsoft.com/office/word/2024/wordml/sdtformatlock" xmlns:w16se="http://schemas.microsoft.com/office/word/2015/wordml/symex" xmlns:wpg="http://schemas.microsoft.com/office/word/2010/wordprocessingGroup" xmlns:wpi="http://schemas.microsoft.com/office/word/2010/wordprocessingInk" xmlns:wne="http://schemas.microsoft.com/office/word/2006/wordml" xmlns:wps="http://schemas.microsoft.com/office/word/2010/wordprocessingShape" mc:Ignorable="w14 w15 w16se w16cid w16 w16cex w16sdtdh w16sdtfl w16du wp14">
+<w:footnotes xmlns:wpc="http://schemas.microsoft.com/office/word/2010/wordprocessingCanvas" xmlns:cx="http://schemas.microsoft.com/office/drawing/2014/chartex" xmlns:cx1="http://schemas.microsoft.com/office/drawing/2015/9/8/chartex" xmlns:cx2="http://schemas.microsoft.com/office/drawing/2015/10/21/chartex" xmlns:cx3="http://schemas.microsoft.com/office/drawing/2016/5/9/chartex" xmlns:cx4="http://schemas.microsoft.com/office/drawing/2016/5/10/chartex" xmlns:cx5="http://schemas.microsoft.com/office/drawing/2016/5/11/chartex" xmlns:cx6="http://schemas.microsoft.com/office/drawing/2016/5/12/chartex" xmlns:cx7="http://schemas.microsoft.com/office/drawing/2016/5/13/chartex" xmlns:cx8="http://schemas.microsoft.com/office/drawing/2016/5/14/chartex" xmlns:mc="http://schemas.openxmlformats.org/markup-compatibility/2006" xmlns:aink="http://schemas.microsoft.com/office/drawing/2016/ink" xmlns:am3d="http://schemas.microsoft.com/office/drawing/2017/model3d" xmlns:o="urn:schemas-microsoft-com:office:office" xmlns:oel="http://schemas.microsoft.com/office/2019/extlst" xmlns:r="http://schemas.openxmlformats.org/officeDocument/2006/relationships" xmlns:m="http://schemas.openxmlformats.org/officeDocument/2006/math" xmlns:v="urn:schemas-microsoft-com:vml" xmlns:wp14="http://schemas.microsoft.com/office/word/2010/wordprocessingDrawing" xmlns:wp="http://schemas.openxmlformats.org/drawingml/2006/wordprocessingDrawing" xmlns:w10="urn:schemas-microsoft-com:office:word" xmlns:w="http://schemas.openxmlformats.org/wordprocessingml/2006/main" xmlns:w14="http://schemas.microsoft.com/office/word/2010/wordml" xmlns:w15="http://schemas.microsoft.com/office/word/2012/wordml" xmlns:w16cex="http://schemas.microsoft.com/office/word/2018/wordml/cex" xmlns:w16cid="http://schemas.microsoft.com/office/word/2016/wordml/cid" xmlns:w16="http://schemas.microsoft.com/office/word/2018/wordml" xmlns:w16du="http://schemas.microsoft.com/office/word/2023/wordml/word16du" xmlns:w16sdtdh="http://schemas.microsoft.com/office/word/2020/wordml/sdtdatahash" xmlns:w16sdtfl="http://schemas.microsoft.com/office/word/2024/wordml/sdtformatlock" xmlns:w16se="http://schemas.microsoft.com/office/word/2015/wordml/symex" xmlns:wpg="http://schemas.microsoft.com/office/word/2010/wordprocessingGroup" xmlns:wpi="http://schemas.microsoft.com/office/word/2010/wordprocessingInk" xmlns:wne="http://schemas.microsoft.com/office/word/2006/wordml" xmlns:wps="http://schemas.microsoft.com/office/word/2010/wordprocessingShape" mc:Ignorable="w14 w15 w16se w16cid w16 w16cex w16sdtdh w16sdtfl w16du wp14">
   <w:footnote w:type="separator" w:id="-1">
     <w:p>
       <w:r>
@@ -4342,7 +4360,7 @@
 </file>
 
 <file path=word/header1.xml><?xml version="1.0" encoding="utf-8"?>
-<w:hdr xmlns:wpc="http://schemas.microsoft.com/office/word/2010/wordprocessingCanvas" xmlns:cx="http://schemas.microsoft.com/office/drawing/2014/chartex" xmlns:cx1="http://schemas.microsoft.com/office/drawing/2015/9/8/chartex" xmlns:cx2="http://schemas.microsoft.com/office/drawing/2015/10/21/chartex" xmlns:cx3="http://schemas.microsoft.com/office/drawing/2016/5/9/chartex" xmlns:cx4="http://schemas.microsoft.com/office/drawing/2016/5/10/chartex" xmlns:cx5="http://schemas.microsoft.com/office/drawing/2016/5/11/chartex" xmlns:cx6="http://schemas.microsoft.com/office/drawing/2016/5/12/chartex" xmlns:cx7="http://schemas.microsoft.com/office/drawing/2016/5/13/chartex" xmlns:cx8="http://schemas.microsoft.com/office/drawing/2016/5/14/chartex" xmlns:mc="http://schemas.openxmlformats.org/markup-compatibility/2006" xmlns:aink="http://schemas.microsoft.com/office/drawing/2016/ink" xmlns:am3d="http://schemas.microsoft.com/office/drawing/2017/model3d" xmlns:o="urn:schemas-microsoft-com:office:office" xmlns:oel="http://schemas.microsoft.com/office/2019/extlst" xmlns:r="http://schemas.openxmlformats.org/officeDocument/2006/relationships" xmlns:m="http://schemas.openxmlformats.org/officeDocument/2006/math" xmlns:v="urn:schemas-microsoft-com:vml" xmlns:wp14="http://schemas.microsoft.com/office/word/2010/wordprocessingDrawing" xmlns:wp="http://schemas.openxmlformats.org/drawingml/2006/wordprocessingDrawing" xmlns:w10="urn:schemas-microsoft-com:office:word" xmlns:w="http://schemas.openxmlformats.org/wordprocessingml/2006/main" xmlns:w14="http://schemas.microsoft.com/office/word/2010/wordml" xmlns:w15="http://schemas.microsoft.com/office/word/2012/wordml" xmlns:w16cei="http://schemas.microsoft.com/office/word/2026/wordml/cei" xmlns:w16cex="http://schemas.microsoft.com/office/word/2018/wordml/cex" xmlns:w16cid="http://schemas.microsoft.com/office/word/2016/wordml/cid" xmlns:w16="http://schemas.microsoft.com/office/word/2018/wordml" xmlns:w16du="http://schemas.microsoft.com/office/word/2023/wordml/word16du" xmlns:w16sdtdh="http://schemas.microsoft.com/office/word/2020/wordml/sdtdatahash" xmlns:w16sdtfl="http://schemas.microsoft.com/office/word/2024/wordml/sdtformatlock" xmlns:w16se="http://schemas.microsoft.com/office/word/2015/wordml/symex" xmlns:wpg="http://schemas.microsoft.com/office/word/2010/wordprocessingGroup" xmlns:wpi="http://schemas.microsoft.com/office/word/2010/wordprocessingInk" xmlns:wne="http://schemas.microsoft.com/office/word/2006/wordml" xmlns:wps="http://schemas.microsoft.com/office/word/2010/wordprocessingShape" mc:Ignorable="w14 w15 w16se w16cid w16 w16cex w16sdtdh w16sdtfl w16du wp14">
+<w:hdr xmlns:wpc="http://schemas.microsoft.com/office/word/2010/wordprocessingCanvas" xmlns:cx="http://schemas.microsoft.com/office/drawing/2014/chartex" xmlns:cx1="http://schemas.microsoft.com/office/drawing/2015/9/8/chartex" xmlns:cx2="http://schemas.microsoft.com/office/drawing/2015/10/21/chartex" xmlns:cx3="http://schemas.microsoft.com/office/drawing/2016/5/9/chartex" xmlns:cx4="http://schemas.microsoft.com/office/drawing/2016/5/10/chartex" xmlns:cx5="http://schemas.microsoft.com/office/drawing/2016/5/11/chartex" xmlns:cx6="http://schemas.microsoft.com/office/drawing/2016/5/12/chartex" xmlns:cx7="http://schemas.microsoft.com/office/drawing/2016/5/13/chartex" xmlns:cx8="http://schemas.microsoft.com/office/drawing/2016/5/14/chartex" xmlns:mc="http://schemas.openxmlformats.org/markup-compatibility/2006" xmlns:aink="http://schemas.microsoft.com/office/drawing/2016/ink" xmlns:am3d="http://schemas.microsoft.com/office/drawing/2017/model3d" xmlns:o="urn:schemas-microsoft-com:office:office" xmlns:oel="http://schemas.microsoft.com/office/2019/extlst" xmlns:r="http://schemas.openxmlformats.org/officeDocument/2006/relationships" xmlns:m="http://schemas.openxmlformats.org/officeDocument/2006/math" xmlns:v="urn:schemas-microsoft-com:vml" xmlns:wp14="http://schemas.microsoft.com/office/word/2010/wordprocessingDrawing" xmlns:wp="http://schemas.openxmlformats.org/drawingml/2006/wordprocessingDrawing" xmlns:w10="urn:schemas-microsoft-com:office:word" xmlns:w="http://schemas.openxmlformats.org/wordprocessingml/2006/main" xmlns:w14="http://schemas.microsoft.com/office/word/2010/wordml" xmlns:w15="http://schemas.microsoft.com/office/word/2012/wordml" xmlns:w16cex="http://schemas.microsoft.com/office/word/2018/wordml/cex" xmlns:w16cid="http://schemas.microsoft.com/office/word/2016/wordml/cid" xmlns:w16="http://schemas.microsoft.com/office/word/2018/wordml" xmlns:w16du="http://schemas.microsoft.com/office/word/2023/wordml/word16du" xmlns:w16sdtdh="http://schemas.microsoft.com/office/word/2020/wordml/sdtdatahash" xmlns:w16sdtfl="http://schemas.microsoft.com/office/word/2024/wordml/sdtformatlock" xmlns:w16se="http://schemas.microsoft.com/office/word/2015/wordml/symex" xmlns:wpg="http://schemas.microsoft.com/office/word/2010/wordprocessingGroup" xmlns:wpi="http://schemas.microsoft.com/office/word/2010/wordprocessingInk" xmlns:wne="http://schemas.microsoft.com/office/word/2006/wordml" xmlns:wps="http://schemas.microsoft.com/office/word/2010/wordprocessingShape" mc:Ignorable="w14 w15 w16se w16cid w16 w16cex w16sdtdh w16sdtfl w16du wp14">
   <w:tbl>
     <w:tblPr>
       <w:tblW w:w="9720" w:type="dxa"/>
@@ -4689,7 +4707,7 @@
             </wp:anchor>
           </w:drawing>
         </mc:Choice>
-        <mc:Fallback>
+        <mc:Fallback xmlns:w16cei="http://schemas.microsoft.com/office/word/2026/wordml/cei">
           <w:pict>
             <v:line w14:anchorId="7E8BAAFE" id="Line 1" o:spid="_x0000_s1026" style="position:absolute;flip:y;z-index:251659264;visibility:visible;mso-wrap-style:square;mso-width-percent:0;mso-height-percent:0;mso-wrap-distance-left:9pt;mso-wrap-distance-top:0;mso-wrap-distance-right:9pt;mso-wrap-distance-bottom:0;mso-position-horizontal:absolute;mso-position-horizontal-relative:margin;mso-position-vertical:absolute;mso-position-vertical-relative:text;mso-width-percent:0;mso-height-percent:0;mso-width-relative:page;mso-height-relative:page" from="-14.4pt,2.95pt" to="464.1pt,4.45pt" o:gfxdata="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" strokeweight="3pt">
               <v:stroke linestyle="thinThin"/>
@@ -4704,7 +4722,7 @@
 </file>
 
 <file path=word/numbering.xml><?xml version="1.0" encoding="utf-8"?>
-<w:numbering xmlns:wpc="http://schemas.microsoft.com/office/word/2010/wordprocessingCanvas" xmlns:cx="http://schemas.microsoft.com/office/drawing/2014/chartex" xmlns:cx1="http://schemas.microsoft.com/office/drawing/2015/9/8/chartex" xmlns:cx2="http://schemas.microsoft.com/office/drawing/2015/10/21/chartex" xmlns:cx3="http://schemas.microsoft.com/office/drawing/2016/5/9/chartex" xmlns:cx4="http://schemas.microsoft.com/office/drawing/2016/5/10/chartex" xmlns:cx5="http://schemas.microsoft.com/office/drawing/2016/5/11/chartex" xmlns:cx6="http://schemas.microsoft.com/office/drawing/2016/5/12/chartex" xmlns:cx7="http://schemas.microsoft.com/office/drawing/2016/5/13/chartex" xmlns:cx8="http://schemas.microsoft.com/office/drawing/2016/5/14/chartex" xmlns:mc="http://schemas.openxmlformats.org/markup-compatibility/2006" xmlns:aink="http://schemas.microsoft.com/office/drawing/2016/ink" xmlns:am3d="http://schemas.microsoft.com/office/drawing/2017/model3d" xmlns:o="urn:schemas-microsoft-com:office:office" xmlns:oel="http://schemas.microsoft.com/office/2019/extlst" xmlns:r="http://schemas.openxmlformats.org/officeDocument/2006/relationships" xmlns:m="http://schemas.openxmlformats.org/officeDocument/2006/math" xmlns:v="urn:schemas-microsoft-com:vml" xmlns:wp14="http://schemas.microsoft.com/office/word/2010/wordprocessingDrawing" xmlns:wp="http://schemas.openxmlformats.org/drawingml/2006/wordprocessingDrawing" xmlns:w10="urn:schemas-microsoft-com:office:word" xmlns:w="http://schemas.openxmlformats.org/wordprocessingml/2006/main" xmlns:w14="http://schemas.microsoft.com/office/word/2010/wordml" xmlns:w15="http://schemas.microsoft.com/office/word/2012/wordml" xmlns:w16cei="http://schemas.microsoft.com/office/word/2026/wordml/cei" xmlns:w16cex="http://schemas.microsoft.com/office/word/2018/wordml/cex" xmlns:w16cid="http://schemas.microsoft.com/office/word/2016/wordml/cid" xmlns:w16="http://schemas.microsoft.com/office/word/2018/wordml" xmlns:w16du="http://schemas.microsoft.com/office/word/2023/wordml/word16du" xmlns:w16sdtdh="http://schemas.microsoft.com/office/word/2020/wordml/sdtdatahash" xmlns:w16sdtfl="http://schemas.microsoft.com/office/word/2024/wordml/sdtformatlock" xmlns:w16se="http://schemas.microsoft.com/office/word/2015/wordml/symex" xmlns:wpg="http://schemas.microsoft.com/office/word/2010/wordprocessingGroup" xmlns:wpi="http://schemas.microsoft.com/office/word/2010/wordprocessingInk" xmlns:wne="http://schemas.microsoft.com/office/word/2006/wordml" xmlns:wps="http://schemas.microsoft.com/office/word/2010/wordprocessingShape" mc:Ignorable="w14 w15 w16se w16cid w16 w16cex w16sdtdh w16sdtfl w16du wp14">
+<w:numbering xmlns:wpc="http://schemas.microsoft.com/office/word/2010/wordprocessingCanvas" xmlns:cx="http://schemas.microsoft.com/office/drawing/2014/chartex" xmlns:cx1="http://schemas.microsoft.com/office/drawing/2015/9/8/chartex" xmlns:cx2="http://schemas.microsoft.com/office/drawing/2015/10/21/chartex" xmlns:cx3="http://schemas.microsoft.com/office/drawing/2016/5/9/chartex" xmlns:cx4="http://schemas.microsoft.com/office/drawing/2016/5/10/chartex" xmlns:cx5="http://schemas.microsoft.com/office/drawing/2016/5/11/chartex" xmlns:cx6="http://schemas.microsoft.com/office/drawing/2016/5/12/chartex" xmlns:cx7="http://schemas.microsoft.com/office/drawing/2016/5/13/chartex" xmlns:cx8="http://schemas.microsoft.com/office/drawing/2016/5/14/chartex" xmlns:mc="http://schemas.openxmlformats.org/markup-compatibility/2006" xmlns:aink="http://schemas.microsoft.com/office/drawing/2016/ink" xmlns:am3d="http://schemas.microsoft.com/office/drawing/2017/model3d" xmlns:o="urn:schemas-microsoft-com:office:office" xmlns:oel="http://schemas.microsoft.com/office/2019/extlst" xmlns:r="http://schemas.openxmlformats.org/officeDocument/2006/relationships" xmlns:m="http://schemas.openxmlformats.org/officeDocument/2006/math" xmlns:v="urn:schemas-microsoft-com:vml" xmlns:wp14="http://schemas.microsoft.com/office/word/2010/wordprocessingDrawing" xmlns:wp="http://schemas.openxmlformats.org/drawingml/2006/wordprocessingDrawing" xmlns:w10="urn:schemas-microsoft-com:office:word" xmlns:w="http://schemas.openxmlformats.org/wordprocessingml/2006/main" xmlns:w14="http://schemas.microsoft.com/office/word/2010/wordml" xmlns:w15="http://schemas.microsoft.com/office/word/2012/wordml" xmlns:w16cex="http://schemas.microsoft.com/office/word/2018/wordml/cex" xmlns:w16cid="http://schemas.microsoft.com/office/word/2016/wordml/cid" xmlns:w16="http://schemas.microsoft.com/office/word/2018/wordml" xmlns:w16du="http://schemas.microsoft.com/office/word/2023/wordml/word16du" xmlns:w16sdtdh="http://schemas.microsoft.com/office/word/2020/wordml/sdtdatahash" xmlns:w16sdtfl="http://schemas.microsoft.com/office/word/2024/wordml/sdtformatlock" xmlns:w16se="http://schemas.microsoft.com/office/word/2015/wordml/symex" xmlns:wpg="http://schemas.microsoft.com/office/word/2010/wordprocessingGroup" xmlns:wpi="http://schemas.microsoft.com/office/word/2010/wordprocessingInk" xmlns:wne="http://schemas.microsoft.com/office/word/2006/wordml" xmlns:wps="http://schemas.microsoft.com/office/word/2010/wordprocessingShape" mc:Ignorable="w14 w15 w16se w16cid w16 w16cex w16sdtdh w16sdtfl w16du wp14">
   <w:abstractNum w:abstractNumId="0" w15:restartNumberingAfterBreak="0">
     <w:nsid w:val="16934123"/>
     <w:multiLevelType w:val="hybridMultilevel"/>
@@ -6486,4 +6504,16 @@
     </a:ext>
   </a:extLst>
 </a:theme>
+</file>
+
+<file path=customXml/item1.xml><?xml version="1.0" encoding="utf-8"?>
+<b:Sources xmlns:b="http://schemas.openxmlformats.org/officeDocument/2006/bibliography" xmlns="http://schemas.openxmlformats.org/officeDocument/2006/bibliography" SelectedStyle="\APASixthEditionOfficeOnline.xsl" StyleName="APA" Version="6"/>
+</file>
+
+<file path=customXml/itemProps1.xml><?xml version="1.0" encoding="utf-8"?>
+<ds:datastoreItem xmlns:ds="http://schemas.openxmlformats.org/officeDocument/2006/customXml" ds:itemID="{8C29E9A3-0A70-4038-A1EE-B5CCD0B9EFF6}">
+  <ds:schemaRefs>
+    <ds:schemaRef ds:uri="http://schemas.openxmlformats.org/officeDocument/2006/bibliography"/>
+  </ds:schemaRefs>
+</ds:datastoreItem>
 </file>
</xml_diff>

<commit_message>
feat(sidang): add auto-approve command for ajuan sidang and enhance template placeholders for signatures
</commit_message>
<xml_diff>
--- a/template/SIDANG/BA sidang akhir TEMPLATE.docx
+++ b/template/SIDANG/BA sidang akhir TEMPLATE.docx
@@ -2302,6 +2302,7 @@
         </w:rPr>
         <w:t xml:space="preserve"> </w:t>
       </w:r>
+      <w:proofErr w:type="gramStart"/>
       <w:r>
         <w:rPr>
           <w:color w:val="000000" w:themeColor="text1"/>
@@ -2323,6 +2324,7 @@
         </w:rPr>
         <w:t>)</w:t>
       </w:r>
+      <w:proofErr w:type="gramEnd"/>
     </w:p>
     <w:p>
       <w:pPr>
@@ -2475,6 +2477,7 @@
         </w:rPr>
         <w:tab/>
       </w:r>
+      <w:proofErr w:type="gramStart"/>
       <w:r>
         <w:rPr>
           <w:color w:val="000000" w:themeColor="text1"/>
@@ -2493,7 +2496,14 @@
         <w:rPr>
           <w:color w:val="000000" w:themeColor="text1"/>
         </w:rPr>
-        <w:t>---</w:t>
+        <w:t>-</w:t>
+      </w:r>
+      <w:proofErr w:type="gramEnd"/>
+      <w:r>
+        <w:rPr>
+          <w:color w:val="000000" w:themeColor="text1"/>
+        </w:rPr>
+        <w:t>--</w:t>
       </w:r>
     </w:p>
     <w:p>
@@ -3225,7 +3235,7 @@
                 <w:sz w:val="24"/>
                 <w:lang w:val="en-US"/>
               </w:rPr>
-              <w:t>(nama penguji I)</w:t>
+              <w:t>${nama_penguji_i}</w:t>
             </w:r>
           </w:p>
         </w:tc>
@@ -3299,7 +3309,7 @@
                 <w:spacing w:val="-2"/>
                 <w:sz w:val="24"/>
               </w:rPr>
-              <w:t>………………..</w:t>
+              <w:t>${signature}</w:t>
             </w:r>
           </w:p>
         </w:tc>
@@ -3353,7 +3363,7 @@
                 <w:sz w:val="24"/>
                 <w:lang w:val="en-US"/>
               </w:rPr>
-              <w:t>(nama penguji II)</w:t>
+              <w:t>${nama_penguji_ii}</w:t>
             </w:r>
           </w:p>
         </w:tc>
@@ -3419,7 +3429,7 @@
                 <w:spacing w:val="-2"/>
                 <w:sz w:val="24"/>
               </w:rPr>
-              <w:t>………………...</w:t>
+              <w:t>${signature}</w:t>
             </w:r>
           </w:p>
         </w:tc>
@@ -3473,7 +3483,7 @@
                 <w:sz w:val="24"/>
                 <w:lang w:val="en-US"/>
               </w:rPr>
-              <w:t>(nama penguji III)</w:t>
+              <w:t>${nama_penguji_iii}</w:t>
             </w:r>
           </w:p>
         </w:tc>
@@ -3539,7 +3549,7 @@
                 <w:spacing w:val="-2"/>
                 <w:sz w:val="24"/>
               </w:rPr>
-              <w:t>………………....</w:t>
+              <w:t>${signature}</w:t>
             </w:r>
           </w:p>
         </w:tc>
@@ -3594,7 +3604,7 @@
                 <w:sz w:val="24"/>
                 <w:lang w:val="en-US"/>
               </w:rPr>
-              <w:t>(nama penguji IV)</w:t>
+              <w:t>${nama_penguji_iv}</w:t>
             </w:r>
           </w:p>
         </w:tc>
@@ -3652,7 +3662,7 @@
                 <w:spacing w:val="-2"/>
                 <w:sz w:val="24"/>
               </w:rPr>
-              <w:t>………………....</w:t>
+              <w:t>${signature}</w:t>
             </w:r>
           </w:p>
         </w:tc>
@@ -3773,7 +3783,7 @@
                 <w:spacing w:val="-2"/>
                 <w:sz w:val="24"/>
               </w:rPr>
-              <w:t>………………....</w:t>
+              <w:t>${signature}</w:t>
             </w:r>
           </w:p>
         </w:tc>
@@ -3885,7 +3895,7 @@
                 <w:spacing w:val="-2"/>
                 <w:sz w:val="24"/>
               </w:rPr>
-              <w:t>………………....</w:t>
+              <w:t>${signature}</w:t>
             </w:r>
           </w:p>
         </w:tc>
@@ -4086,6 +4096,7 @@
           <w:rFonts w:ascii="Times New Roman" w:hAnsi="Times New Roman" w:cs="Times New Roman"/>
           <w:color w:val="000000" w:themeColor="text1"/>
           <w:sz w:val="26"/>
+          <w:lang w:val="fi-FI"/>
         </w:rPr>
       </w:pPr>
       <w:r>
@@ -4095,15 +4106,34 @@
           <w:sz w:val="26"/>
           <w:lang w:val="fi-FI"/>
         </w:rPr>
-        <w:t xml:space="preserve">Tanda Tangan                                                 </w:t>
+        <w:t>${signature_kaprodi}</w:t>
       </w:r>
       <w:r>
         <w:rPr>
           <w:rFonts w:ascii="Times New Roman" w:hAnsi="Times New Roman" w:cs="Times New Roman"/>
           <w:color w:val="000000" w:themeColor="text1"/>
           <w:sz w:val="26"/>
-        </w:rPr>
-        <w:t>Tanda Tangan</w:t>
+          <w:lang w:val="fi-FI"/>
+        </w:rPr>
+        <w:t xml:space="preserve">                                                 </w:t>
+      </w:r>
+      <w:r>
+        <w:rPr>
+          <w:rFonts w:ascii="Times New Roman" w:hAnsi="Times New Roman" w:cs="Times New Roman"/>
+          <w:color w:val="000000" w:themeColor="text1"/>
+          <w:sz w:val="26"/>
+          <w:lang w:val="fi-FI"/>
+        </w:rPr>
+        <w:t>${signature_ketua_sidang}</w:t>
+      </w:r>
+      <w:r>
+        <w:rPr>
+          <w:rFonts w:ascii="Times New Roman" w:hAnsi="Times New Roman" w:cs="Times New Roman"/>
+          <w:color w:val="000000" w:themeColor="text1"/>
+          <w:sz w:val="26"/>
+          <w:lang w:val="fi-FI"/>
+        </w:rPr>
+        <w:t/>
       </w:r>
     </w:p>
     <w:p>
@@ -4145,6 +4175,7 @@
       <w:r>
         <w:rPr>
           <w:color w:val="000000" w:themeColor="text1"/>
+          <w:u w:val="single"/>
           <w:lang w:val="fi-FI"/>
         </w:rPr>
         <w:t>${nama_ketua_sidang}</w:t>
@@ -4178,7 +4209,7 @@
           <w:color w:val="000000" w:themeColor="text1"/>
           <w:lang w:val="fi-FI"/>
         </w:rPr>
-        <w:t>${signature}</w:t>
+        <w:t>Tanda</w:t>
       </w:r>
       <w:r>
         <w:rPr>
@@ -4187,7 +4218,7 @@
           <w:spacing w:val="-3"/>
           <w:lang w:val="fi-FI"/>
         </w:rPr>
-        <w:t xml:space="preserve"/>
+        <w:t xml:space="preserve"> </w:t>
       </w:r>
       <w:r>
         <w:rPr>
@@ -4195,7 +4226,7 @@
           <w:color w:val="000000" w:themeColor="text1"/>
           <w:lang w:val="fi-FI"/>
         </w:rPr>
-        <w:t/>
+        <w:t>Tangan</w:t>
       </w:r>
       <w:r>
         <w:rPr>
@@ -4204,7 +4235,7 @@
           <w:spacing w:val="-2"/>
           <w:lang w:val="fi-FI"/>
         </w:rPr>
-        <w:t xml:space="preserve"/>
+        <w:t xml:space="preserve"> </w:t>
       </w:r>
       <w:r>
         <w:rPr>
@@ -4212,7 +4243,7 @@
           <w:color w:val="000000" w:themeColor="text1"/>
           <w:lang w:val="fi-FI"/>
         </w:rPr>
-        <w:t/>
+        <w:t>dan</w:t>
       </w:r>
       <w:r>
         <w:rPr>
@@ -4221,7 +4252,7 @@
           <w:spacing w:val="-2"/>
           <w:lang w:val="fi-FI"/>
         </w:rPr>
-        <w:t xml:space="preserve"/>
+        <w:t xml:space="preserve"> </w:t>
       </w:r>
       <w:r>
         <w:rPr>
@@ -4229,7 +4260,7 @@
           <w:color w:val="000000" w:themeColor="text1"/>
           <w:lang w:val="fi-FI"/>
         </w:rPr>
-        <w:t/>
+        <w:t>Nama</w:t>
       </w:r>
       <w:r>
         <w:rPr>
@@ -4238,7 +4269,7 @@
           <w:spacing w:val="-2"/>
           <w:lang w:val="fi-FI"/>
         </w:rPr>
-        <w:t xml:space="preserve"/>
+        <w:t xml:space="preserve"> Jelas</w:t>
       </w:r>
       <w:r>
         <w:rPr>
@@ -4247,7 +4278,7 @@
           <w:lang w:val="fi-FI"/>
         </w:rPr>
         <w:tab/>
-        <w:t>${signature}</w:t>
+        <w:t>Tanda</w:t>
       </w:r>
       <w:r>
         <w:rPr>
@@ -4256,7 +4287,7 @@
           <w:spacing w:val="-3"/>
           <w:lang w:val="fi-FI"/>
         </w:rPr>
-        <w:t xml:space="preserve"/>
+        <w:t xml:space="preserve"> </w:t>
       </w:r>
       <w:r>
         <w:rPr>
@@ -4264,7 +4295,7 @@
           <w:color w:val="000000" w:themeColor="text1"/>
           <w:lang w:val="fi-FI"/>
         </w:rPr>
-        <w:t/>
+        <w:t>Tangan</w:t>
       </w:r>
       <w:r>
         <w:rPr>
@@ -4273,7 +4304,7 @@
           <w:spacing w:val="-2"/>
           <w:lang w:val="fi-FI"/>
         </w:rPr>
-        <w:t xml:space="preserve"/>
+        <w:t xml:space="preserve"> </w:t>
       </w:r>
       <w:r>
         <w:rPr>
@@ -4281,7 +4312,7 @@
           <w:color w:val="000000" w:themeColor="text1"/>
           <w:lang w:val="fi-FI"/>
         </w:rPr>
-        <w:t/>
+        <w:t>dan</w:t>
       </w:r>
       <w:r>
         <w:rPr>
@@ -4290,7 +4321,7 @@
           <w:spacing w:val="-2"/>
           <w:lang w:val="fi-FI"/>
         </w:rPr>
-        <w:t xml:space="preserve"/>
+        <w:t xml:space="preserve"> </w:t>
       </w:r>
       <w:r>
         <w:rPr>
@@ -4298,7 +4329,7 @@
           <w:color w:val="000000" w:themeColor="text1"/>
           <w:lang w:val="fi-FI"/>
         </w:rPr>
-        <w:t/>
+        <w:t>Nama</w:t>
       </w:r>
       <w:r>
         <w:rPr>
@@ -4307,7 +4338,7 @@
           <w:spacing w:val="-2"/>
           <w:lang w:val="fi-FI"/>
         </w:rPr>
-        <w:t xml:space="preserve"/>
+        <w:t xml:space="preserve"> Jelas</w:t>
       </w:r>
     </w:p>
     <w:sectPr>

</xml_diff>